<commit_message>
docs:change the title of 2 docs
</commit_message>
<xml_diff>
--- a/docs/01_行业和领域调研分析报告.docx
+++ b/docs/01_行业和领域调研分析报告.docx
@@ -6,6 +6,9 @@
     <w:p>
       <w:pPr>
         <w:ind w:firstLine="480"/>
+        <w:rPr>
+          <w:rFonts w:hint="eastAsia"/>
+        </w:rPr>
       </w:pPr>
     </w:p>
     <w:p>
@@ -128,13 +131,33 @@
       </w:r>
       <w:r>
         <w:rPr>
-          <w:rFonts w:eastAsia="隶书" w:hint="eastAsia"/>
+          <w:rFonts w:eastAsia="隶书"/>
           <w:b/>
           <w:bCs/>
           <w:sz w:val="72"/>
           <w:szCs w:val="21"/>
         </w:rPr>
-        <w:t>航旅智行</w:t>
+        <w:t>基于</w:t>
+      </w:r>
+      <w:r>
+        <w:rPr>
+          <w:rFonts w:eastAsia="隶书"/>
+          <w:b/>
+          <w:bCs/>
+          <w:sz w:val="72"/>
+          <w:szCs w:val="21"/>
+        </w:rPr>
+        <w:t>Agent</w:t>
+      </w:r>
+      <w:r>
+        <w:rPr>
+          <w:rFonts w:eastAsia="隶书"/>
+          <w:b/>
+          <w:bCs/>
+          <w:sz w:val="72"/>
+          <w:szCs w:val="21"/>
+        </w:rPr>
+        <w:t>的民航旅客状态感知与行动决策系统</w:t>
       </w:r>
       <w:r>
         <w:rPr>
@@ -210,10 +233,10 @@
             <v:path o:extrusionok="f" gradientshapeok="t" o:connecttype="rect"/>
             <o:lock v:ext="edit" aspectratio="t"/>
           </v:shapetype>
-          <v:shape id="_x0000_i1025" type="#_x0000_t75" style="width:165.15pt;height:153.25pt" o:ole="">
+          <v:shape id="_x0000_i1025" type="#_x0000_t75" style="width:165.05pt;height:153.25pt" o:ole="">
             <v:imagedata r:id="rId9" o:title=""/>
           </v:shape>
-          <o:OLEObject Type="Embed" ProgID="PBrush" ShapeID="_x0000_i1025" DrawAspect="Content" ObjectID="_1849888612" r:id="rId10"/>
+          <o:OLEObject Type="Embed" ProgID="PBrush" ShapeID="_x0000_i1025" DrawAspect="Content" ObjectID="_1850321383" r:id="rId10"/>
         </w:object>
       </w:r>
     </w:p>
@@ -1209,6 +1232,7 @@
           <w:sz w:val="28"/>
           <w:szCs w:val="28"/>
         </w:rPr>
+        <w:lastRenderedPageBreak/>
         <w:t>二</w:t>
       </w:r>
       <w:r>
@@ -1414,7 +1438,7 @@
       <w:pPr>
         <w:ind w:firstLineChars="200" w:firstLine="420"/>
         <w:rPr>
-          <w:rFonts w:ascii="宋体" w:eastAsia="宋体" w:hAnsi="宋体"/>
+          <w:rFonts w:ascii="宋体" w:eastAsia="宋体" w:hAnsi="宋体" w:hint="eastAsia"/>
         </w:rPr>
       </w:pPr>
     </w:p>
@@ -1540,7 +1564,16 @@
           <w:sz w:val="24"/>
           <w:szCs w:val="24"/>
         </w:rPr>
-        <w:t>机场运行与航班保障系统。航司、机场和空管侧已经使用运行控制、资源调度、旅客服务和保障协同系统，能够支撑专业人员进行航班运行决策。此类系统面向行业工作人员，通常不直接向旅客解释内部状态，也不会根据每名旅客的当前位置生成个体化行动路径。</w:t>
+        <w:t>机场运行与航班保障系统。航司、机场和空管侧已经使用运行控制、资源调度、旅客服务和保障协同系统，能够支撑专业人员进行航班运行决策。此类系统面向</w:t>
+      </w:r>
+      <w:r>
+        <w:rPr>
+          <w:rFonts w:ascii="宋体" w:eastAsia="宋体" w:hAnsi="宋体" w:hint="eastAsia"/>
+          <w:sz w:val="24"/>
+          <w:szCs w:val="24"/>
+        </w:rPr>
+        <w:lastRenderedPageBreak/>
+        <w:t>行业工作人员，通常不直接向旅客解释内部状态，也不会根据每名旅客的当前位置生成个体化行动路径。</w:t>
       </w:r>
     </w:p>
     <w:p>
@@ -1790,7 +1823,16 @@
           <w:sz w:val="24"/>
           <w:szCs w:val="24"/>
         </w:rPr>
-        <w:t>状态到行动的转换不足。大多数产品能告诉旅客“航班延误了”或“登机口变了”，但没有进一步回答“我现在应该出发吗、走哪条路线、是否需要改签、还剩多少缓冲时间”。</w:t>
+        <w:t>状态到行动的转换不足。大多数产品能告诉旅客“航班延误了”或“登机口变</w:t>
+      </w:r>
+      <w:r>
+        <w:rPr>
+          <w:rFonts w:ascii="宋体" w:eastAsia="宋体" w:hAnsi="宋体" w:hint="eastAsia"/>
+          <w:sz w:val="24"/>
+          <w:szCs w:val="24"/>
+        </w:rPr>
+        <w:lastRenderedPageBreak/>
+        <w:t>了”，但没有进一步回答“我现在应该出发吗、走哪条路线、是否需要改签、还剩多少缓冲时间”。</w:t>
       </w:r>
     </w:p>
     <w:p>
@@ -2079,6 +2121,7 @@
           <w:sz w:val="24"/>
           <w:szCs w:val="24"/>
         </w:rPr>
+        <w:lastRenderedPageBreak/>
         <w:t>资料来源：</w:t>
       </w:r>
       <w:r>

</xml_diff>